<commit_message>
Updated vision stamenet since github will get intergrated at phase 2
</commit_message>
<xml_diff>
--- a/Requirements_and_documents/Vision_statement_platform/Vision_Statement.docx
+++ b/Requirements_and_documents/Vision_statement_platform/Vision_Statement.docx
@@ -79,10 +79,7 @@
     </w:p>
     <w:p>
       <w:r>
-        <w:t>This product is an AI-driven project execution platform for Agile teams that transforms natural language into structured work and automates the coordination layer of software development. It removes the need for manual task management, fragmented tool switching, and repetitive reporting by turning communication directly into actionable workflows. The result is a development environment where planning, tracking, and reporting are continuously automated and synchronized with actual engineering activity.</w:t>
-      </w:r>
-      <w:r>
-        <w:t xml:space="preserve"> </w:t>
+        <w:t xml:space="preserve">This product is an AI-driven project execution platform for Agile teams that transforms natural language into structured work and automates the coordination layer of software development. It removes the need for manual task management, fragmented tool switching, and repetitive reporting by turning communication directly into actionable workflows. The result is a development environment where planning, tracking, and reporting are continuously automated and synchronized with actual engineering activity. </w:t>
       </w:r>
       <w:r>
         <w:t xml:space="preserve">This automated project management platform targets to automate the whole project management process for companies. Marketing targets are the following: </w:t>
@@ -308,21 +305,13 @@
         <w:t xml:space="preserve">   </w:t>
       </w:r>
       <w:r>
-        <w:t xml:space="preserve">Project managers spend significant time creating, structuring, and maintaining Kanban </w:t>
-      </w:r>
-      <w:proofErr w:type="gramStart"/>
-      <w:r>
-        <w:t xml:space="preserve">tasks </w:t>
+        <w:t xml:space="preserve">Project managers spend significant time creating, structuring, and maintaining Kanban tasks </w:t>
       </w:r>
       <w:r>
         <w:t xml:space="preserve"> </w:t>
       </w:r>
       <w:r>
-        <w:t>manually</w:t>
-      </w:r>
-      <w:proofErr w:type="gramEnd"/>
-      <w:r>
-        <w:t>. This includes writing task descriptions, defining checklists, assigning priorities, and updating task status across multiple tools.</w:t>
+        <w:t>manually. This includes writing task descriptions, defining checklists, assigning priorities, and updating task status across multiple tools.</w:t>
       </w:r>
     </w:p>
     <w:p>
@@ -397,6 +386,9 @@
       <w:r>
         <w:t xml:space="preserve">GitHub repository tracking </w:t>
       </w:r>
+      <w:r>
+        <w:t>(Later)</w:t>
+      </w:r>
     </w:p>
     <w:p>
       <w:pPr>
@@ -747,6 +739,13 @@
         </w:rPr>
         <w:t>6. Disconnected Git workflow from project management</w:t>
       </w:r>
+      <w:r>
+        <w:rPr>
+          <w:b/>
+          <w:bCs/>
+        </w:rPr>
+        <w:t xml:space="preserve"> (Later implementation)</w:t>
+      </w:r>
     </w:p>
     <w:p>
       <w:r>
@@ -813,7 +812,6 @@
         <w:rPr>
           <w:b/>
           <w:bCs/>
-          <w:lang w:val="el-GR"/>
         </w:rPr>
         <w:t xml:space="preserve"> </w:t>
       </w:r>
@@ -821,7 +819,6 @@
         <w:rPr>
           <w:b/>
           <w:bCs/>
-          <w:lang w:val="el-GR"/>
         </w:rPr>
         <w:br/>
       </w:r>
@@ -829,7 +826,6 @@
         <w:rPr>
           <w:b/>
           <w:bCs/>
-          <w:lang w:val="el-GR"/>
         </w:rPr>
         <w:br/>
       </w:r>
@@ -837,7 +833,6 @@
         <w:rPr>
           <w:b/>
           <w:bCs/>
-          <w:lang w:val="el-GR"/>
         </w:rPr>
         <w:br/>
       </w:r>
@@ -880,30 +875,11 @@
       </w:r>
     </w:p>
     <w:p>
-      <w:pPr>
-        <w:rPr>
-          <w:lang w:val="el-GR"/>
-        </w:rPr>
-      </w:pPr>
-      <w:r>
-        <w:t xml:space="preserve">This AI assistant gets one task and tries to break it into smaller pieces </w:t>
-      </w:r>
-      <w:proofErr w:type="gramStart"/>
-      <w:r>
-        <w:t>in order to</w:t>
-      </w:r>
-      <w:proofErr w:type="gramEnd"/>
-      <w:r>
-        <w:t xml:space="preserve"> make it easier for developers. </w:t>
-      </w:r>
-    </w:p>
-    <w:p>
-      <w:pPr>
-        <w:rPr>
-          <w:lang w:val="el-GR"/>
-        </w:rPr>
-      </w:pPr>
-    </w:p>
+      <w:r>
+        <w:t xml:space="preserve">This AI assistant gets one task and tries to break it into smaller pieces in order to make it easier for developers. </w:t>
+      </w:r>
+    </w:p>
+    <w:p/>
     <w:p>
       <w:pPr>
         <w:rPr>
@@ -926,15 +902,7 @@
     </w:p>
     <w:p>
       <w:r>
-        <w:t xml:space="preserve">This platform enables PMs to create kanban cards and assign them to developers automatically. Developers will be notified through the </w:t>
-      </w:r>
-      <w:proofErr w:type="gramStart"/>
-      <w:r>
-        <w:t>agent</w:t>
-      </w:r>
-      <w:proofErr w:type="gramEnd"/>
-      <w:r>
-        <w:t xml:space="preserve"> and they won’t waste time on writing code for old requirements</w:t>
+        <w:t>This platform enables PMs to create kanban cards and assign them to developers automatically. Developers will be notified through the agent and they won’t waste time on writing code for old requirements</w:t>
       </w:r>
     </w:p>
     <w:p>
@@ -954,15 +922,7 @@
     </w:p>
     <w:p>
       <w:r>
-        <w:t xml:space="preserve">Development teams waste so much time on meetings and sometimes they do not take any decision. This platform automates the meeting process since developers post in the agent what they did yesterday and what they will do today. The agent creates analytical reports and eliminates the need for </w:t>
-      </w:r>
-      <w:proofErr w:type="gramStart"/>
-      <w:r>
-        <w:t>stand up</w:t>
-      </w:r>
-      <w:proofErr w:type="gramEnd"/>
-      <w:r>
-        <w:t xml:space="preserve"> meetings.</w:t>
+        <w:t>Development teams waste so much time on meetings and sometimes they do not take any decision. This platform automates the meeting process since developers post in the agent what they did yesterday and what they will do today. The agent creates analytical reports and eliminates the need for stand up meetings.</w:t>
       </w:r>
     </w:p>
     <w:p>
@@ -1017,14 +977,35 @@
     </w:p>
     <w:p>
       <w:r>
-        <w:t>The platform is an AI-powered workflow automation layer for Agile software teams that sits on top of existing development tools (e.g. GitHub, Kanban systems) and transforms unstructured input (text or voice) into structured, trackable work.</w:t>
-      </w:r>
-    </w:p>
-    <w:p>
+        <w:t>The platform is an AI-powered workflow automation layer for Agile software teams that sits on top of existing development tools (e.g. GitHub</w:t>
+      </w:r>
+      <w:r>
+        <w:t xml:space="preserve"> (later)</w:t>
+      </w:r>
+      <w:r>
+        <w:t>, Kanban systems) and transforms unstructured input (text or voice) into structured, trackable work.</w:t>
+      </w:r>
+    </w:p>
+    <w:p>
+      <w:pPr>
+        <w:rPr>
+          <w:lang w:val="el-GR"/>
+        </w:rPr>
+      </w:pPr>
       <w:r>
         <w:t>Instead of manually managing tasks, status updates, and reporting, the system uses an AI agent to orchestrate the entire workflow lifecycle from idea → execution → delivery.</w:t>
       </w:r>
     </w:p>
+    <w:p>
+      <w:r>
+        <w:rPr>
+          <w:b/>
+          <w:bCs/>
+        </w:rPr>
+        <w:t>External integrations (e.g., GitHub) are optional adapters. The core workflow platform must remain fully functional without them.</w:t>
+      </w:r>
+    </w:p>
+    <w:p/>
     <w:p/>
     <w:p/>
     <w:p/>

</xml_diff>